<commit_message>
update Problem statement.docx with latest competition details
</commit_message>
<xml_diff>
--- a/Problem statement.docx
+++ b/Problem statement.docx
@@ -67,12 +67,7 @@
         <w:t xml:space="preserve"> </w:t>
       </w:r>
       <w:r>
-        <w:t>safe space</w:t>
-      </w:r>
-      <w:bookmarkStart w:id="0" w:name="_GoBack"/>
-      <w:bookmarkEnd w:id="0"/>
-      <w:r>
-        <w:t xml:space="preserve"> disappears. Schools and municipalities remain completely blind to burning-out communities until a quiet struggle becomes a tragic statistic.</w:t>
+        <w:t>safe space disappears. Schools and municipalities remain completely blind to burning-out communities until a quiet struggle becomes a tragic statistic.</w:t>
       </w:r>
     </w:p>
     <w:p>
@@ -669,6 +664,1748 @@
         </w:rPr>
         <w:t>Unlike pure apps (emol, Awarefy), Kokoro bridges physical personal belongings into digital 3D companions and connects directly into clinical/municipal workflows.</w:t>
       </w:r>
+    </w:p>
+    <w:tbl>
+      <w:tblPr>
+        <w:tblW w:w="0" w:type="auto"/>
+        <w:tblCellSpacing w:w="15" w:type="dxa"/>
+        <w:tblInd w:w="10" w:type="dxa"/>
+        <w:tblBorders>
+          <w:top w:val="none" w:color="auto" w:sz="0" w:space="0"/>
+          <w:left w:val="none" w:color="auto" w:sz="0" w:space="0"/>
+          <w:bottom w:val="none" w:color="auto" w:sz="0" w:space="0"/>
+          <w:right w:val="none" w:color="auto" w:sz="0" w:space="0"/>
+          <w:insideH w:val="none" w:color="auto" w:sz="0" w:space="0"/>
+          <w:insideV w:val="none" w:color="auto" w:sz="0" w:space="0"/>
+        </w:tblBorders>
+        <w:shd w:val="clear"/>
+        <w:tblLayout w:type="autofit"/>
+        <w:tblCellMar>
+          <w:top w:w="15" w:type="dxa"/>
+          <w:left w:w="15" w:type="dxa"/>
+          <w:bottom w:w="15" w:type="dxa"/>
+          <w:right w:w="15" w:type="dxa"/>
+        </w:tblCellMar>
+      </w:tblPr>
+      <w:tblGrid>
+        <w:gridCol w:w="1884"/>
+        <w:gridCol w:w="1897"/>
+        <w:gridCol w:w="2086"/>
+        <w:gridCol w:w="2869"/>
+      </w:tblGrid>
+      <w:tr>
+        <w:tblPrEx>
+          <w:tblBorders>
+            <w:top w:val="none" w:color="auto" w:sz="0" w:space="0"/>
+            <w:left w:val="none" w:color="auto" w:sz="0" w:space="0"/>
+            <w:bottom w:val="none" w:color="auto" w:sz="0" w:space="0"/>
+            <w:right w:val="none" w:color="auto" w:sz="0" w:space="0"/>
+            <w:insideH w:val="none" w:color="auto" w:sz="0" w:space="0"/>
+            <w:insideV w:val="none" w:color="auto" w:sz="0" w:space="0"/>
+          </w:tblBorders>
+          <w:shd w:val="clear"/>
+          <w:tblCellMar>
+            <w:top w:w="15" w:type="dxa"/>
+            <w:left w:w="15" w:type="dxa"/>
+            <w:bottom w:w="15" w:type="dxa"/>
+            <w:right w:w="15" w:type="dxa"/>
+          </w:tblCellMar>
+        </w:tblPrEx>
+        <w:trPr>
+          <w:tblHeader/>
+          <w:tblCellSpacing w:w="15" w:type="dxa"/>
+        </w:trPr>
+        <w:tc>
+          <w:tcPr>
+            <w:tcW w:w="0" w:type="auto"/>
+            <w:tcBorders>
+              <w:top w:val="single" w:color="C4C7C5" w:sz="4" w:space="0"/>
+              <w:left w:val="single" w:color="C4C7C5" w:sz="4" w:space="0"/>
+              <w:bottom w:val="single" w:color="C4C7C5" w:sz="4" w:space="0"/>
+              <w:right w:val="single" w:color="C4C7C5" w:sz="4" w:space="0"/>
+            </w:tcBorders>
+            <w:shd w:val="clear"/>
+            <w:tcMar>
+              <w:top w:w="120" w:type="dxa"/>
+              <w:left w:w="180" w:type="dxa"/>
+              <w:bottom w:w="120" w:type="dxa"/>
+              <w:right w:w="180" w:type="dxa"/>
+            </w:tcMar>
+            <w:vAlign w:val="center"/>
+          </w:tcPr>
+          <w:p>
+            <w:pPr>
+              <w:keepNext w:val="0"/>
+              <w:keepLines w:val="0"/>
+              <w:widowControl/>
+              <w:suppressLineNumbers w:val="0"/>
+              <w:spacing w:before="0" w:beforeAutospacing="0" w:line="14" w:lineRule="atLeast"/>
+              <w:ind w:left="0" w:right="0"/>
+              <w:jc w:val="left"/>
+              <w:rPr>
+                <w:rFonts w:ascii="sans-serif" w:hAnsi="sans-serif" w:eastAsia="sans-serif" w:cs="sans-serif"/>
+              </w:rPr>
+            </w:pPr>
+            <w:r>
+              <w:rPr>
+                <w:rStyle w:val="5"/>
+                <w:rFonts w:hint="default" w:ascii="sans-serif" w:hAnsi="sans-serif" w:eastAsia="sans-serif" w:cs="sans-serif"/>
+                <w:kern w:val="0"/>
+                <w:sz w:val="24"/>
+                <w:szCs w:val="24"/>
+                <w:lang w:val="en-US" w:eastAsia="zh-CN" w:bidi="ar"/>
+              </w:rPr>
+              <w:t>Dimension</w:t>
+            </w:r>
+          </w:p>
+        </w:tc>
+        <w:tc>
+          <w:tcPr>
+            <w:tcW w:w="0" w:type="auto"/>
+            <w:tcBorders>
+              <w:top w:val="single" w:color="C4C7C5" w:sz="4" w:space="0"/>
+              <w:left w:val="single" w:color="C4C7C5" w:sz="4" w:space="0"/>
+              <w:bottom w:val="single" w:color="C4C7C5" w:sz="4" w:space="0"/>
+              <w:right w:val="single" w:color="C4C7C5" w:sz="4" w:space="0"/>
+            </w:tcBorders>
+            <w:shd w:val="clear"/>
+            <w:tcMar>
+              <w:top w:w="120" w:type="dxa"/>
+              <w:left w:w="180" w:type="dxa"/>
+              <w:bottom w:w="120" w:type="dxa"/>
+              <w:right w:w="180" w:type="dxa"/>
+            </w:tcMar>
+            <w:vAlign w:val="center"/>
+          </w:tcPr>
+          <w:p>
+            <w:pPr>
+              <w:keepNext w:val="0"/>
+              <w:keepLines w:val="0"/>
+              <w:widowControl/>
+              <w:suppressLineNumbers w:val="0"/>
+              <w:spacing w:before="0" w:beforeAutospacing="0" w:line="14" w:lineRule="atLeast"/>
+              <w:ind w:left="0" w:right="0"/>
+              <w:jc w:val="left"/>
+              <w:rPr>
+                <w:rFonts w:hint="default" w:ascii="sans-serif" w:hAnsi="sans-serif" w:eastAsia="sans-serif" w:cs="sans-serif"/>
+              </w:rPr>
+            </w:pPr>
+            <w:r>
+              <w:rPr>
+                <w:rStyle w:val="5"/>
+                <w:rFonts w:hint="default" w:ascii="sans-serif" w:hAnsi="sans-serif" w:eastAsia="sans-serif" w:cs="sans-serif"/>
+                <w:kern w:val="0"/>
+                <w:sz w:val="24"/>
+                <w:szCs w:val="24"/>
+                <w:lang w:val="en-US" w:eastAsia="zh-CN" w:bidi="ar"/>
+              </w:rPr>
+              <w:t>Traditional Care (School Counselors / Hotlines)</w:t>
+            </w:r>
+          </w:p>
+        </w:tc>
+        <w:tc>
+          <w:tcPr>
+            <w:tcW w:w="0" w:type="auto"/>
+            <w:tcBorders>
+              <w:top w:val="single" w:color="C4C7C5" w:sz="4" w:space="0"/>
+              <w:left w:val="single" w:color="C4C7C5" w:sz="4" w:space="0"/>
+              <w:bottom w:val="single" w:color="C4C7C5" w:sz="4" w:space="0"/>
+              <w:right w:val="single" w:color="C4C7C5" w:sz="4" w:space="0"/>
+            </w:tcBorders>
+            <w:shd w:val="clear"/>
+            <w:tcMar>
+              <w:top w:w="120" w:type="dxa"/>
+              <w:left w:w="180" w:type="dxa"/>
+              <w:bottom w:w="120" w:type="dxa"/>
+              <w:right w:w="180" w:type="dxa"/>
+            </w:tcMar>
+            <w:vAlign w:val="center"/>
+          </w:tcPr>
+          <w:p>
+            <w:pPr>
+              <w:keepNext w:val="0"/>
+              <w:keepLines w:val="0"/>
+              <w:widowControl/>
+              <w:suppressLineNumbers w:val="0"/>
+              <w:spacing w:before="0" w:beforeAutospacing="0" w:line="14" w:lineRule="atLeast"/>
+              <w:ind w:left="0" w:right="0"/>
+              <w:jc w:val="left"/>
+              <w:rPr>
+                <w:rFonts w:hint="default" w:ascii="sans-serif" w:hAnsi="sans-serif" w:eastAsia="sans-serif" w:cs="sans-serif"/>
+              </w:rPr>
+            </w:pPr>
+            <w:r>
+              <w:rPr>
+                <w:rStyle w:val="5"/>
+                <w:rFonts w:hint="default" w:ascii="sans-serif" w:hAnsi="sans-serif" w:eastAsia="sans-serif" w:cs="sans-serif"/>
+                <w:kern w:val="0"/>
+                <w:sz w:val="24"/>
+                <w:szCs w:val="24"/>
+                <w:lang w:val="en-US" w:eastAsia="zh-CN" w:bidi="ar"/>
+              </w:rPr>
+              <w:t>Existing Digital Apps (e.g., emol, Awarefy, Woebot)</w:t>
+            </w:r>
+          </w:p>
+        </w:tc>
+        <w:tc>
+          <w:tcPr>
+            <w:tcW w:w="0" w:type="auto"/>
+            <w:tcBorders>
+              <w:top w:val="single" w:color="C4C7C5" w:sz="4" w:space="0"/>
+              <w:left w:val="single" w:color="C4C7C5" w:sz="4" w:space="0"/>
+              <w:bottom w:val="single" w:color="C4C7C5" w:sz="4" w:space="0"/>
+              <w:right w:val="single" w:color="C4C7C5" w:sz="4" w:space="0"/>
+            </w:tcBorders>
+            <w:shd w:val="clear"/>
+            <w:tcMar>
+              <w:top w:w="120" w:type="dxa"/>
+              <w:left w:w="180" w:type="dxa"/>
+              <w:bottom w:w="120" w:type="dxa"/>
+              <w:right w:w="180" w:type="dxa"/>
+            </w:tcMar>
+            <w:vAlign w:val="center"/>
+          </w:tcPr>
+          <w:p>
+            <w:pPr>
+              <w:keepNext w:val="0"/>
+              <w:keepLines w:val="0"/>
+              <w:widowControl/>
+              <w:suppressLineNumbers w:val="0"/>
+              <w:spacing w:before="0" w:beforeAutospacing="0" w:line="14" w:lineRule="atLeast"/>
+              <w:ind w:left="0" w:right="0"/>
+              <w:jc w:val="left"/>
+              <w:rPr>
+                <w:rFonts w:hint="default" w:ascii="sans-serif" w:hAnsi="sans-serif" w:eastAsia="sans-serif" w:cs="sans-serif"/>
+              </w:rPr>
+            </w:pPr>
+            <w:r>
+              <w:rPr>
+                <w:rStyle w:val="5"/>
+                <w:rFonts w:hint="default" w:ascii="sans-serif" w:hAnsi="sans-serif" w:eastAsia="sans-serif" w:cs="sans-serif"/>
+                <w:kern w:val="0"/>
+                <w:sz w:val="24"/>
+                <w:szCs w:val="24"/>
+                <w:lang w:val="en-US" w:eastAsia="zh-CN" w:bidi="ar"/>
+              </w:rPr>
+              <w:t>Kokoro Companion (Our Solution)</w:t>
+            </w:r>
+          </w:p>
+        </w:tc>
+      </w:tr>
+      <w:tr>
+        <w:tblPrEx>
+          <w:tblBorders>
+            <w:top w:val="none" w:color="auto" w:sz="0" w:space="0"/>
+            <w:left w:val="none" w:color="auto" w:sz="0" w:space="0"/>
+            <w:bottom w:val="none" w:color="auto" w:sz="0" w:space="0"/>
+            <w:right w:val="none" w:color="auto" w:sz="0" w:space="0"/>
+            <w:insideH w:val="none" w:color="auto" w:sz="0" w:space="0"/>
+            <w:insideV w:val="none" w:color="auto" w:sz="0" w:space="0"/>
+          </w:tblBorders>
+          <w:tblCellMar>
+            <w:top w:w="15" w:type="dxa"/>
+            <w:left w:w="15" w:type="dxa"/>
+            <w:bottom w:w="15" w:type="dxa"/>
+            <w:right w:w="15" w:type="dxa"/>
+          </w:tblCellMar>
+        </w:tblPrEx>
+        <w:trPr>
+          <w:tblCellSpacing w:w="15" w:type="dxa"/>
+        </w:trPr>
+        <w:tc>
+          <w:tcPr>
+            <w:tcW w:w="0" w:type="auto"/>
+            <w:tcBorders>
+              <w:top w:val="single" w:color="C4C7C5" w:sz="4" w:space="0"/>
+              <w:left w:val="single" w:color="C4C7C5" w:sz="4" w:space="0"/>
+              <w:bottom w:val="single" w:color="C4C7C5" w:sz="4" w:space="0"/>
+              <w:right w:val="single" w:color="C4C7C5" w:sz="4" w:space="0"/>
+            </w:tcBorders>
+            <w:shd w:val="clear"/>
+            <w:tcMar>
+              <w:top w:w="120" w:type="dxa"/>
+              <w:left w:w="180" w:type="dxa"/>
+              <w:bottom w:w="120" w:type="dxa"/>
+              <w:right w:w="180" w:type="dxa"/>
+            </w:tcMar>
+            <w:vAlign w:val="center"/>
+          </w:tcPr>
+          <w:p>
+            <w:pPr>
+              <w:keepNext w:val="0"/>
+              <w:keepLines w:val="0"/>
+              <w:widowControl/>
+              <w:suppressLineNumbers w:val="0"/>
+              <w:spacing w:before="0" w:beforeAutospacing="0" w:line="14" w:lineRule="atLeast"/>
+              <w:ind w:left="0" w:right="0"/>
+              <w:jc w:val="left"/>
+              <w:rPr>
+                <w:rFonts w:hint="default" w:ascii="sans-serif" w:hAnsi="sans-serif" w:eastAsia="sans-serif" w:cs="sans-serif"/>
+              </w:rPr>
+            </w:pPr>
+            <w:r>
+              <w:rPr>
+                <w:rFonts w:hint="default" w:ascii="sans-serif" w:hAnsi="sans-serif" w:eastAsia="sans-serif" w:cs="sans-serif"/>
+                <w:b/>
+                <w:bCs/>
+                <w:kern w:val="0"/>
+                <w:sz w:val="24"/>
+                <w:szCs w:val="24"/>
+                <w:lang w:val="en-US" w:eastAsia="zh-CN" w:bidi="ar"/>
+              </w:rPr>
+              <w:t>First-Step Friction</w:t>
+            </w:r>
+          </w:p>
+        </w:tc>
+        <w:tc>
+          <w:tcPr>
+            <w:tcW w:w="0" w:type="auto"/>
+            <w:tcBorders>
+              <w:top w:val="single" w:color="C4C7C5" w:sz="4" w:space="0"/>
+              <w:left w:val="single" w:color="C4C7C5" w:sz="4" w:space="0"/>
+              <w:bottom w:val="single" w:color="C4C7C5" w:sz="4" w:space="0"/>
+              <w:right w:val="single" w:color="C4C7C5" w:sz="4" w:space="0"/>
+            </w:tcBorders>
+            <w:shd w:val="clear"/>
+            <w:tcMar>
+              <w:top w:w="120" w:type="dxa"/>
+              <w:left w:w="180" w:type="dxa"/>
+              <w:bottom w:w="120" w:type="dxa"/>
+              <w:right w:w="180" w:type="dxa"/>
+            </w:tcMar>
+            <w:vAlign w:val="center"/>
+          </w:tcPr>
+          <w:p>
+            <w:pPr>
+              <w:pStyle w:val="4"/>
+              <w:keepNext w:val="0"/>
+              <w:keepLines w:val="0"/>
+              <w:widowControl/>
+              <w:suppressLineNumbers w:val="0"/>
+              <w:spacing w:before="0" w:beforeAutospacing="0" w:after="0" w:afterAutospacing="0" w:line="14" w:lineRule="atLeast"/>
+              <w:ind w:left="0" w:right="0"/>
+              <w:rPr>
+                <w:rFonts w:hint="default" w:ascii="sans-serif" w:hAnsi="sans-serif" w:eastAsia="sans-serif" w:cs="sans-serif"/>
+              </w:rPr>
+            </w:pPr>
+            <w:r>
+              <w:rPr>
+                <w:rFonts w:hint="default" w:ascii="sans-serif" w:hAnsi="sans-serif" w:eastAsia="sans-serif" w:cs="sans-serif"/>
+                <w:b/>
+                <w:bCs/>
+              </w:rPr>
+              <w:t>Extremely High</w:t>
+            </w:r>
+          </w:p>
+          <w:p>
+            <w:pPr>
+              <w:keepNext w:val="0"/>
+              <w:keepLines w:val="0"/>
+              <w:widowControl/>
+              <w:suppressLineNumbers w:val="0"/>
+              <w:spacing w:before="0" w:beforeAutospacing="0" w:line="14" w:lineRule="atLeast"/>
+              <w:ind w:left="0" w:right="0"/>
+              <w:jc w:val="left"/>
+              <w:rPr>
+                <w:rFonts w:hint="default" w:ascii="sans-serif" w:hAnsi="sans-serif" w:eastAsia="sans-serif" w:cs="sans-serif"/>
+              </w:rPr>
+            </w:pPr>
+          </w:p>
+          <w:p>
+            <w:pPr>
+              <w:pStyle w:val="4"/>
+              <w:keepNext w:val="0"/>
+              <w:keepLines w:val="0"/>
+              <w:widowControl/>
+              <w:suppressLineNumbers w:val="0"/>
+              <w:spacing w:before="0" w:beforeAutospacing="0" w:after="0" w:afterAutospacing="0" w:line="14" w:lineRule="atLeast"/>
+              <w:ind w:left="0" w:right="0"/>
+              <w:rPr>
+                <w:rFonts w:hint="default" w:ascii="sans-serif" w:hAnsi="sans-serif" w:eastAsia="sans-serif" w:cs="sans-serif"/>
+              </w:rPr>
+            </w:pPr>
+            <w:r>
+              <w:rPr>
+                <w:rFonts w:hint="default" w:ascii="sans-serif" w:hAnsi="sans-serif" w:eastAsia="sans-serif" w:cs="sans-serif"/>
+              </w:rPr>
+              <w:t xml:space="preserve">Requires walking into a counselor's office or calling a hotline, breaking </w:t>
+            </w:r>
+            <w:r>
+              <w:rPr>
+                <w:rFonts w:hint="default" w:ascii="sans-serif" w:hAnsi="sans-serif" w:eastAsia="sans-serif" w:cs="sans-serif"/>
+                <w:i/>
+                <w:iCs/>
+              </w:rPr>
+              <w:t>Gaman</w:t>
+            </w:r>
+            <w:r>
+              <w:rPr>
+                <w:rFonts w:hint="default" w:ascii="sans-serif" w:hAnsi="sans-serif" w:eastAsia="sans-serif" w:cs="sans-serif"/>
+              </w:rPr>
+              <w:t xml:space="preserve"> (silent endurance) and risking </w:t>
+            </w:r>
+            <w:r>
+              <w:rPr>
+                <w:rFonts w:hint="default" w:ascii="sans-serif" w:hAnsi="sans-serif" w:eastAsia="sans-serif" w:cs="sans-serif"/>
+                <w:i/>
+                <w:iCs/>
+              </w:rPr>
+              <w:t>Seken-tei</w:t>
+            </w:r>
+            <w:r>
+              <w:rPr>
+                <w:rFonts w:hint="default" w:ascii="sans-serif" w:hAnsi="sans-serif" w:eastAsia="sans-serif" w:cs="sans-serif"/>
+              </w:rPr>
+              <w:t xml:space="preserve"> (social judgment).</w:t>
+            </w:r>
+          </w:p>
+        </w:tc>
+        <w:tc>
+          <w:tcPr>
+            <w:tcW w:w="0" w:type="auto"/>
+            <w:tcBorders>
+              <w:top w:val="single" w:color="C4C7C5" w:sz="4" w:space="0"/>
+              <w:left w:val="single" w:color="C4C7C5" w:sz="4" w:space="0"/>
+              <w:bottom w:val="single" w:color="C4C7C5" w:sz="4" w:space="0"/>
+              <w:right w:val="single" w:color="C4C7C5" w:sz="4" w:space="0"/>
+            </w:tcBorders>
+            <w:shd w:val="clear"/>
+            <w:tcMar>
+              <w:top w:w="120" w:type="dxa"/>
+              <w:left w:w="180" w:type="dxa"/>
+              <w:bottom w:w="120" w:type="dxa"/>
+              <w:right w:w="180" w:type="dxa"/>
+            </w:tcMar>
+            <w:vAlign w:val="center"/>
+          </w:tcPr>
+          <w:p>
+            <w:pPr>
+              <w:pStyle w:val="4"/>
+              <w:keepNext w:val="0"/>
+              <w:keepLines w:val="0"/>
+              <w:widowControl/>
+              <w:suppressLineNumbers w:val="0"/>
+              <w:spacing w:before="0" w:beforeAutospacing="0" w:after="0" w:afterAutospacing="0" w:line="14" w:lineRule="atLeast"/>
+              <w:ind w:left="0" w:right="0"/>
+              <w:rPr>
+                <w:rFonts w:hint="default" w:ascii="sans-serif" w:hAnsi="sans-serif" w:eastAsia="sans-serif" w:cs="sans-serif"/>
+              </w:rPr>
+            </w:pPr>
+            <w:r>
+              <w:rPr>
+                <w:rFonts w:hint="default" w:ascii="sans-serif" w:hAnsi="sans-serif" w:eastAsia="sans-serif" w:cs="sans-serif"/>
+                <w:b/>
+                <w:bCs/>
+              </w:rPr>
+              <w:t>Medium</w:t>
+            </w:r>
+          </w:p>
+          <w:p>
+            <w:pPr>
+              <w:keepNext w:val="0"/>
+              <w:keepLines w:val="0"/>
+              <w:widowControl/>
+              <w:suppressLineNumbers w:val="0"/>
+              <w:spacing w:before="0" w:beforeAutospacing="0" w:line="14" w:lineRule="atLeast"/>
+              <w:ind w:left="0" w:right="0"/>
+              <w:jc w:val="left"/>
+              <w:rPr>
+                <w:rFonts w:hint="default" w:ascii="sans-serif" w:hAnsi="sans-serif" w:eastAsia="sans-serif" w:cs="sans-serif"/>
+              </w:rPr>
+            </w:pPr>
+          </w:p>
+          <w:p>
+            <w:pPr>
+              <w:pStyle w:val="4"/>
+              <w:keepNext w:val="0"/>
+              <w:keepLines w:val="0"/>
+              <w:widowControl/>
+              <w:suppressLineNumbers w:val="0"/>
+              <w:spacing w:before="0" w:beforeAutospacing="0" w:after="0" w:afterAutospacing="0" w:line="14" w:lineRule="atLeast"/>
+              <w:ind w:left="0" w:right="0"/>
+              <w:rPr>
+                <w:rFonts w:hint="default" w:ascii="sans-serif" w:hAnsi="sans-serif" w:eastAsia="sans-serif" w:cs="sans-serif"/>
+              </w:rPr>
+            </w:pPr>
+            <w:r>
+              <w:rPr>
+                <w:rFonts w:hint="default" w:ascii="sans-serif" w:hAnsi="sans-serif" w:eastAsia="sans-serif" w:cs="sans-serif"/>
+              </w:rPr>
+              <w:t>Downloading a clinical/mood-tracking app requires self-identifying as someone who "needs mental health help."</w:t>
+            </w:r>
+          </w:p>
+        </w:tc>
+        <w:tc>
+          <w:tcPr>
+            <w:tcW w:w="0" w:type="auto"/>
+            <w:tcBorders>
+              <w:top w:val="single" w:color="C4C7C5" w:sz="4" w:space="0"/>
+              <w:left w:val="single" w:color="C4C7C5" w:sz="4" w:space="0"/>
+              <w:bottom w:val="single" w:color="C4C7C5" w:sz="4" w:space="0"/>
+              <w:right w:val="single" w:color="C4C7C5" w:sz="4" w:space="0"/>
+            </w:tcBorders>
+            <w:shd w:val="clear"/>
+            <w:tcMar>
+              <w:top w:w="120" w:type="dxa"/>
+              <w:left w:w="180" w:type="dxa"/>
+              <w:bottom w:w="120" w:type="dxa"/>
+              <w:right w:w="180" w:type="dxa"/>
+            </w:tcMar>
+            <w:vAlign w:val="center"/>
+          </w:tcPr>
+          <w:p>
+            <w:pPr>
+              <w:pStyle w:val="4"/>
+              <w:keepNext w:val="0"/>
+              <w:keepLines w:val="0"/>
+              <w:widowControl/>
+              <w:suppressLineNumbers w:val="0"/>
+              <w:spacing w:before="0" w:beforeAutospacing="0" w:after="0" w:afterAutospacing="0" w:line="14" w:lineRule="atLeast"/>
+              <w:ind w:left="0" w:right="0"/>
+              <w:rPr>
+                <w:rFonts w:hint="default" w:ascii="sans-serif" w:hAnsi="sans-serif" w:eastAsia="sans-serif" w:cs="sans-serif"/>
+              </w:rPr>
+            </w:pPr>
+            <w:r>
+              <w:rPr>
+                <w:rFonts w:hint="default" w:ascii="sans-serif" w:hAnsi="sans-serif" w:eastAsia="sans-serif" w:cs="sans-serif"/>
+                <w:b/>
+                <w:bCs/>
+              </w:rPr>
+              <w:t>Zero / Micro-Friction</w:t>
+            </w:r>
+          </w:p>
+          <w:p>
+            <w:pPr>
+              <w:keepNext w:val="0"/>
+              <w:keepLines w:val="0"/>
+              <w:widowControl/>
+              <w:suppressLineNumbers w:val="0"/>
+              <w:spacing w:before="0" w:beforeAutospacing="0" w:line="14" w:lineRule="atLeast"/>
+              <w:ind w:left="0" w:right="0"/>
+              <w:jc w:val="left"/>
+              <w:rPr>
+                <w:rFonts w:hint="default" w:ascii="sans-serif" w:hAnsi="sans-serif" w:eastAsia="sans-serif" w:cs="sans-serif"/>
+              </w:rPr>
+            </w:pPr>
+          </w:p>
+          <w:p>
+            <w:pPr>
+              <w:pStyle w:val="4"/>
+              <w:keepNext w:val="0"/>
+              <w:keepLines w:val="0"/>
+              <w:widowControl/>
+              <w:suppressLineNumbers w:val="0"/>
+              <w:spacing w:before="0" w:beforeAutospacing="0" w:after="0" w:afterAutospacing="0" w:line="14" w:lineRule="atLeast"/>
+              <w:ind w:left="0" w:right="0"/>
+              <w:rPr>
+                <w:rFonts w:hint="default" w:ascii="sans-serif" w:hAnsi="sans-serif" w:eastAsia="sans-serif" w:cs="sans-serif"/>
+              </w:rPr>
+            </w:pPr>
+            <w:r>
+              <w:rPr>
+                <w:rFonts w:hint="default" w:ascii="sans-serif" w:hAnsi="sans-serif" w:eastAsia="sans-serif" w:cs="sans-serif"/>
+              </w:rPr>
+              <w:t xml:space="preserve">Users scan their </w:t>
+            </w:r>
+            <w:r>
+              <w:rPr>
+                <w:rFonts w:hint="default" w:ascii="sans-serif" w:hAnsi="sans-serif" w:eastAsia="sans-serif" w:cs="sans-serif"/>
+                <w:i/>
+                <w:iCs/>
+              </w:rPr>
+              <w:t>own physical comfort object</w:t>
+            </w:r>
+            <w:r>
+              <w:rPr>
+                <w:rFonts w:hint="default" w:ascii="sans-serif" w:hAnsi="sans-serif" w:eastAsia="sans-serif" w:cs="sans-serif"/>
+              </w:rPr>
+              <w:t xml:space="preserve"> (plushie, keychain). Talking to a familiar object externalizes distress without stigma.</w:t>
+            </w:r>
+          </w:p>
+        </w:tc>
+      </w:tr>
+      <w:tr>
+        <w:tblPrEx>
+          <w:tblBorders>
+            <w:top w:val="none" w:color="auto" w:sz="0" w:space="0"/>
+            <w:left w:val="none" w:color="auto" w:sz="0" w:space="0"/>
+            <w:bottom w:val="none" w:color="auto" w:sz="0" w:space="0"/>
+            <w:right w:val="none" w:color="auto" w:sz="0" w:space="0"/>
+            <w:insideH w:val="none" w:color="auto" w:sz="0" w:space="0"/>
+            <w:insideV w:val="none" w:color="auto" w:sz="0" w:space="0"/>
+          </w:tblBorders>
+          <w:shd w:val="clear"/>
+          <w:tblCellMar>
+            <w:top w:w="15" w:type="dxa"/>
+            <w:left w:w="15" w:type="dxa"/>
+            <w:bottom w:w="15" w:type="dxa"/>
+            <w:right w:w="15" w:type="dxa"/>
+          </w:tblCellMar>
+        </w:tblPrEx>
+        <w:trPr>
+          <w:tblCellSpacing w:w="15" w:type="dxa"/>
+        </w:trPr>
+        <w:tc>
+          <w:tcPr>
+            <w:tcW w:w="0" w:type="auto"/>
+            <w:tcBorders>
+              <w:top w:val="single" w:color="C4C7C5" w:sz="4" w:space="0"/>
+              <w:left w:val="single" w:color="C4C7C5" w:sz="4" w:space="0"/>
+              <w:bottom w:val="single" w:color="C4C7C5" w:sz="4" w:space="0"/>
+              <w:right w:val="single" w:color="C4C7C5" w:sz="4" w:space="0"/>
+            </w:tcBorders>
+            <w:shd w:val="clear"/>
+            <w:tcMar>
+              <w:top w:w="120" w:type="dxa"/>
+              <w:left w:w="180" w:type="dxa"/>
+              <w:bottom w:w="120" w:type="dxa"/>
+              <w:right w:w="180" w:type="dxa"/>
+            </w:tcMar>
+            <w:vAlign w:val="center"/>
+          </w:tcPr>
+          <w:p>
+            <w:pPr>
+              <w:keepNext w:val="0"/>
+              <w:keepLines w:val="0"/>
+              <w:widowControl/>
+              <w:suppressLineNumbers w:val="0"/>
+              <w:spacing w:before="0" w:beforeAutospacing="0" w:line="14" w:lineRule="atLeast"/>
+              <w:ind w:left="0" w:right="0"/>
+              <w:jc w:val="left"/>
+              <w:rPr>
+                <w:rFonts w:hint="default" w:ascii="sans-serif" w:hAnsi="sans-serif" w:eastAsia="sans-serif" w:cs="sans-serif"/>
+              </w:rPr>
+            </w:pPr>
+            <w:r>
+              <w:rPr>
+                <w:rFonts w:hint="default" w:ascii="sans-serif" w:hAnsi="sans-serif" w:eastAsia="sans-serif" w:cs="sans-serif"/>
+                <w:b/>
+                <w:bCs/>
+                <w:kern w:val="0"/>
+                <w:sz w:val="24"/>
+                <w:szCs w:val="24"/>
+                <w:lang w:val="en-US" w:eastAsia="zh-CN" w:bidi="ar"/>
+              </w:rPr>
+              <w:t>User Interface &amp; Engagement</w:t>
+            </w:r>
+          </w:p>
+        </w:tc>
+        <w:tc>
+          <w:tcPr>
+            <w:tcW w:w="0" w:type="auto"/>
+            <w:tcBorders>
+              <w:top w:val="single" w:color="C4C7C5" w:sz="4" w:space="0"/>
+              <w:left w:val="single" w:color="C4C7C5" w:sz="4" w:space="0"/>
+              <w:bottom w:val="single" w:color="C4C7C5" w:sz="4" w:space="0"/>
+              <w:right w:val="single" w:color="C4C7C5" w:sz="4" w:space="0"/>
+            </w:tcBorders>
+            <w:shd w:val="clear"/>
+            <w:tcMar>
+              <w:top w:w="120" w:type="dxa"/>
+              <w:left w:w="180" w:type="dxa"/>
+              <w:bottom w:w="120" w:type="dxa"/>
+              <w:right w:w="180" w:type="dxa"/>
+            </w:tcMar>
+            <w:vAlign w:val="center"/>
+          </w:tcPr>
+          <w:p>
+            <w:pPr>
+              <w:keepNext w:val="0"/>
+              <w:keepLines w:val="0"/>
+              <w:widowControl/>
+              <w:suppressLineNumbers w:val="0"/>
+              <w:spacing w:before="0" w:beforeAutospacing="0" w:line="14" w:lineRule="atLeast"/>
+              <w:ind w:left="0" w:right="0"/>
+              <w:jc w:val="left"/>
+              <w:rPr>
+                <w:rFonts w:hint="default" w:ascii="sans-serif" w:hAnsi="sans-serif" w:eastAsia="sans-serif" w:cs="sans-serif"/>
+              </w:rPr>
+            </w:pPr>
+            <w:r>
+              <w:rPr>
+                <w:rFonts w:hint="default" w:ascii="sans-serif" w:hAnsi="sans-serif" w:eastAsia="sans-serif" w:cs="sans-serif"/>
+                <w:kern w:val="0"/>
+                <w:sz w:val="24"/>
+                <w:szCs w:val="24"/>
+                <w:lang w:val="en-US" w:eastAsia="zh-CN" w:bidi="ar"/>
+              </w:rPr>
+              <w:t>Face-to-face or phone call; highly formal, intimidating, and scheduled.</w:t>
+            </w:r>
+          </w:p>
+        </w:tc>
+        <w:tc>
+          <w:tcPr>
+            <w:tcW w:w="0" w:type="auto"/>
+            <w:tcBorders>
+              <w:top w:val="single" w:color="C4C7C5" w:sz="4" w:space="0"/>
+              <w:left w:val="single" w:color="C4C7C5" w:sz="4" w:space="0"/>
+              <w:bottom w:val="single" w:color="C4C7C5" w:sz="4" w:space="0"/>
+              <w:right w:val="single" w:color="C4C7C5" w:sz="4" w:space="0"/>
+            </w:tcBorders>
+            <w:shd w:val="clear"/>
+            <w:tcMar>
+              <w:top w:w="120" w:type="dxa"/>
+              <w:left w:w="180" w:type="dxa"/>
+              <w:bottom w:w="120" w:type="dxa"/>
+              <w:right w:w="180" w:type="dxa"/>
+            </w:tcMar>
+            <w:vAlign w:val="center"/>
+          </w:tcPr>
+          <w:p>
+            <w:pPr>
+              <w:keepNext w:val="0"/>
+              <w:keepLines w:val="0"/>
+              <w:widowControl/>
+              <w:suppressLineNumbers w:val="0"/>
+              <w:spacing w:before="0" w:beforeAutospacing="0" w:line="14" w:lineRule="atLeast"/>
+              <w:ind w:left="0" w:right="0"/>
+              <w:jc w:val="left"/>
+              <w:rPr>
+                <w:rFonts w:hint="default" w:ascii="sans-serif" w:hAnsi="sans-serif" w:eastAsia="sans-serif" w:cs="sans-serif"/>
+              </w:rPr>
+            </w:pPr>
+            <w:r>
+              <w:rPr>
+                <w:rFonts w:hint="default" w:ascii="sans-serif" w:hAnsi="sans-serif" w:eastAsia="sans-serif" w:cs="sans-serif"/>
+                <w:kern w:val="0"/>
+                <w:sz w:val="24"/>
+                <w:szCs w:val="24"/>
+                <w:lang w:val="en-US" w:eastAsia="zh-CN" w:bidi="ar"/>
+              </w:rPr>
+              <w:t>Generic 2D text interfaces, clinical surveys, or stock avatars.</w:t>
+            </w:r>
+          </w:p>
+        </w:tc>
+        <w:tc>
+          <w:tcPr>
+            <w:tcW w:w="0" w:type="auto"/>
+            <w:tcBorders>
+              <w:top w:val="single" w:color="C4C7C5" w:sz="4" w:space="0"/>
+              <w:left w:val="single" w:color="C4C7C5" w:sz="4" w:space="0"/>
+              <w:bottom w:val="single" w:color="C4C7C5" w:sz="4" w:space="0"/>
+              <w:right w:val="single" w:color="C4C7C5" w:sz="4" w:space="0"/>
+            </w:tcBorders>
+            <w:shd w:val="clear"/>
+            <w:tcMar>
+              <w:top w:w="120" w:type="dxa"/>
+              <w:left w:w="180" w:type="dxa"/>
+              <w:bottom w:w="120" w:type="dxa"/>
+              <w:right w:w="180" w:type="dxa"/>
+            </w:tcMar>
+            <w:vAlign w:val="center"/>
+          </w:tcPr>
+          <w:p>
+            <w:pPr>
+              <w:pStyle w:val="4"/>
+              <w:keepNext w:val="0"/>
+              <w:keepLines w:val="0"/>
+              <w:widowControl/>
+              <w:suppressLineNumbers w:val="0"/>
+              <w:spacing w:before="0" w:beforeAutospacing="0" w:after="0" w:afterAutospacing="0" w:line="14" w:lineRule="atLeast"/>
+              <w:ind w:left="0" w:right="0"/>
+              <w:rPr>
+                <w:rFonts w:hint="default" w:ascii="sans-serif" w:hAnsi="sans-serif" w:eastAsia="sans-serif" w:cs="sans-serif"/>
+              </w:rPr>
+            </w:pPr>
+            <w:r>
+              <w:rPr>
+                <w:rFonts w:hint="default" w:ascii="sans-serif" w:hAnsi="sans-serif" w:eastAsia="sans-serif" w:cs="sans-serif"/>
+                <w:b/>
+                <w:bCs/>
+              </w:rPr>
+              <w:t>3D AR/VR Multi-Agent</w:t>
+            </w:r>
+          </w:p>
+          <w:p>
+            <w:pPr>
+              <w:keepNext w:val="0"/>
+              <w:keepLines w:val="0"/>
+              <w:widowControl/>
+              <w:suppressLineNumbers w:val="0"/>
+              <w:spacing w:before="0" w:beforeAutospacing="0" w:line="14" w:lineRule="atLeast"/>
+              <w:ind w:left="0" w:right="0"/>
+              <w:jc w:val="left"/>
+              <w:rPr>
+                <w:rFonts w:hint="default" w:ascii="sans-serif" w:hAnsi="sans-serif" w:eastAsia="sans-serif" w:cs="sans-serif"/>
+              </w:rPr>
+            </w:pPr>
+          </w:p>
+          <w:p>
+            <w:pPr>
+              <w:pStyle w:val="4"/>
+              <w:keepNext w:val="0"/>
+              <w:keepLines w:val="0"/>
+              <w:widowControl/>
+              <w:suppressLineNumbers w:val="0"/>
+              <w:spacing w:before="0" w:beforeAutospacing="0" w:after="0" w:afterAutospacing="0" w:line="14" w:lineRule="atLeast"/>
+              <w:ind w:left="0" w:right="0"/>
+              <w:rPr>
+                <w:rFonts w:hint="default" w:ascii="sans-serif" w:hAnsi="sans-serif" w:eastAsia="sans-serif" w:cs="sans-serif"/>
+              </w:rPr>
+            </w:pPr>
+            <w:r>
+              <w:rPr>
+                <w:rFonts w:hint="default" w:ascii="sans-serif" w:hAnsi="sans-serif" w:eastAsia="sans-serif" w:cs="sans-serif"/>
+              </w:rPr>
+              <w:t>Interactive, photorealistic 3D models generated from personal items with distinct, interconnected agent personalities.</w:t>
+            </w:r>
+          </w:p>
+        </w:tc>
+      </w:tr>
+      <w:tr>
+        <w:tblPrEx>
+          <w:tblBorders>
+            <w:top w:val="none" w:color="auto" w:sz="0" w:space="0"/>
+            <w:left w:val="none" w:color="auto" w:sz="0" w:space="0"/>
+            <w:bottom w:val="none" w:color="auto" w:sz="0" w:space="0"/>
+            <w:right w:val="none" w:color="auto" w:sz="0" w:space="0"/>
+            <w:insideH w:val="none" w:color="auto" w:sz="0" w:space="0"/>
+            <w:insideV w:val="none" w:color="auto" w:sz="0" w:space="0"/>
+          </w:tblBorders>
+          <w:shd w:val="clear"/>
+          <w:tblCellMar>
+            <w:top w:w="15" w:type="dxa"/>
+            <w:left w:w="15" w:type="dxa"/>
+            <w:bottom w:w="15" w:type="dxa"/>
+            <w:right w:w="15" w:type="dxa"/>
+          </w:tblCellMar>
+        </w:tblPrEx>
+        <w:trPr>
+          <w:tblCellSpacing w:w="15" w:type="dxa"/>
+        </w:trPr>
+        <w:tc>
+          <w:tcPr>
+            <w:tcW w:w="0" w:type="auto"/>
+            <w:tcBorders>
+              <w:top w:val="single" w:color="C4C7C5" w:sz="4" w:space="0"/>
+              <w:left w:val="single" w:color="C4C7C5" w:sz="4" w:space="0"/>
+              <w:bottom w:val="single" w:color="C4C7C5" w:sz="4" w:space="0"/>
+              <w:right w:val="single" w:color="C4C7C5" w:sz="4" w:space="0"/>
+            </w:tcBorders>
+            <w:shd w:val="clear"/>
+            <w:tcMar>
+              <w:top w:w="120" w:type="dxa"/>
+              <w:left w:w="180" w:type="dxa"/>
+              <w:bottom w:w="120" w:type="dxa"/>
+              <w:right w:w="180" w:type="dxa"/>
+            </w:tcMar>
+            <w:vAlign w:val="center"/>
+          </w:tcPr>
+          <w:p>
+            <w:pPr>
+              <w:keepNext w:val="0"/>
+              <w:keepLines w:val="0"/>
+              <w:widowControl/>
+              <w:suppressLineNumbers w:val="0"/>
+              <w:spacing w:before="0" w:beforeAutospacing="0" w:line="14" w:lineRule="atLeast"/>
+              <w:ind w:left="0" w:right="0"/>
+              <w:jc w:val="left"/>
+              <w:rPr>
+                <w:rFonts w:hint="default" w:ascii="sans-serif" w:hAnsi="sans-serif" w:eastAsia="sans-serif" w:cs="sans-serif"/>
+              </w:rPr>
+            </w:pPr>
+            <w:r>
+              <w:rPr>
+                <w:rFonts w:hint="default" w:ascii="sans-serif" w:hAnsi="sans-serif" w:eastAsia="sans-serif" w:cs="sans-serif"/>
+                <w:b/>
+                <w:bCs/>
+                <w:kern w:val="0"/>
+                <w:sz w:val="24"/>
+                <w:szCs w:val="24"/>
+                <w:lang w:val="en-US" w:eastAsia="zh-CN" w:bidi="ar"/>
+              </w:rPr>
+              <w:t>Privacy &amp; Psychological Safety</w:t>
+            </w:r>
+          </w:p>
+        </w:tc>
+        <w:tc>
+          <w:tcPr>
+            <w:tcW w:w="0" w:type="auto"/>
+            <w:tcBorders>
+              <w:top w:val="single" w:color="C4C7C5" w:sz="4" w:space="0"/>
+              <w:left w:val="single" w:color="C4C7C5" w:sz="4" w:space="0"/>
+              <w:bottom w:val="single" w:color="C4C7C5" w:sz="4" w:space="0"/>
+              <w:right w:val="single" w:color="C4C7C5" w:sz="4" w:space="0"/>
+            </w:tcBorders>
+            <w:shd w:val="clear"/>
+            <w:tcMar>
+              <w:top w:w="120" w:type="dxa"/>
+              <w:left w:w="180" w:type="dxa"/>
+              <w:bottom w:w="120" w:type="dxa"/>
+              <w:right w:w="180" w:type="dxa"/>
+            </w:tcMar>
+            <w:vAlign w:val="center"/>
+          </w:tcPr>
+          <w:p>
+            <w:pPr>
+              <w:keepNext w:val="0"/>
+              <w:keepLines w:val="0"/>
+              <w:widowControl/>
+              <w:suppressLineNumbers w:val="0"/>
+              <w:spacing w:before="0" w:beforeAutospacing="0" w:line="14" w:lineRule="atLeast"/>
+              <w:ind w:left="0" w:right="0"/>
+              <w:jc w:val="left"/>
+              <w:rPr>
+                <w:rFonts w:hint="default" w:ascii="sans-serif" w:hAnsi="sans-serif" w:eastAsia="sans-serif" w:cs="sans-serif"/>
+              </w:rPr>
+            </w:pPr>
+            <w:r>
+              <w:rPr>
+                <w:rFonts w:hint="default" w:ascii="sans-serif" w:hAnsi="sans-serif" w:eastAsia="sans-serif" w:cs="sans-serif"/>
+                <w:kern w:val="0"/>
+                <w:sz w:val="24"/>
+                <w:szCs w:val="24"/>
+                <w:lang w:val="en-US" w:eastAsia="zh-CN" w:bidi="ar"/>
+              </w:rPr>
+              <w:t>High risk of perceived exposure (being seen entering a counseling room by peers).</w:t>
+            </w:r>
+          </w:p>
+        </w:tc>
+        <w:tc>
+          <w:tcPr>
+            <w:tcW w:w="0" w:type="auto"/>
+            <w:tcBorders>
+              <w:top w:val="single" w:color="C4C7C5" w:sz="4" w:space="0"/>
+              <w:left w:val="single" w:color="C4C7C5" w:sz="4" w:space="0"/>
+              <w:bottom w:val="single" w:color="C4C7C5" w:sz="4" w:space="0"/>
+              <w:right w:val="single" w:color="C4C7C5" w:sz="4" w:space="0"/>
+            </w:tcBorders>
+            <w:shd w:val="clear"/>
+            <w:tcMar>
+              <w:top w:w="120" w:type="dxa"/>
+              <w:left w:w="180" w:type="dxa"/>
+              <w:bottom w:w="120" w:type="dxa"/>
+              <w:right w:w="180" w:type="dxa"/>
+            </w:tcMar>
+            <w:vAlign w:val="center"/>
+          </w:tcPr>
+          <w:p>
+            <w:pPr>
+              <w:keepNext w:val="0"/>
+              <w:keepLines w:val="0"/>
+              <w:widowControl/>
+              <w:suppressLineNumbers w:val="0"/>
+              <w:spacing w:before="0" w:beforeAutospacing="0" w:line="14" w:lineRule="atLeast"/>
+              <w:ind w:left="0" w:right="0"/>
+              <w:jc w:val="left"/>
+              <w:rPr>
+                <w:rFonts w:hint="default" w:ascii="sans-serif" w:hAnsi="sans-serif" w:eastAsia="sans-serif" w:cs="sans-serif"/>
+              </w:rPr>
+            </w:pPr>
+            <w:r>
+              <w:rPr>
+                <w:rFonts w:hint="default" w:ascii="sans-serif" w:hAnsi="sans-serif" w:eastAsia="sans-serif" w:cs="sans-serif"/>
+                <w:kern w:val="0"/>
+                <w:sz w:val="24"/>
+                <w:szCs w:val="24"/>
+                <w:lang w:val="en-US" w:eastAsia="zh-CN" w:bidi="ar"/>
+              </w:rPr>
+              <w:t>Centralized user data; minimal integration with real-world care providers.</w:t>
+            </w:r>
+          </w:p>
+        </w:tc>
+        <w:tc>
+          <w:tcPr>
+            <w:tcW w:w="0" w:type="auto"/>
+            <w:tcBorders>
+              <w:top w:val="single" w:color="C4C7C5" w:sz="4" w:space="0"/>
+              <w:left w:val="single" w:color="C4C7C5" w:sz="4" w:space="0"/>
+              <w:bottom w:val="single" w:color="C4C7C5" w:sz="4" w:space="0"/>
+              <w:right w:val="single" w:color="C4C7C5" w:sz="4" w:space="0"/>
+            </w:tcBorders>
+            <w:shd w:val="clear"/>
+            <w:tcMar>
+              <w:top w:w="120" w:type="dxa"/>
+              <w:left w:w="180" w:type="dxa"/>
+              <w:bottom w:w="120" w:type="dxa"/>
+              <w:right w:w="180" w:type="dxa"/>
+            </w:tcMar>
+            <w:vAlign w:val="center"/>
+          </w:tcPr>
+          <w:p>
+            <w:pPr>
+              <w:pStyle w:val="4"/>
+              <w:keepNext w:val="0"/>
+              <w:keepLines w:val="0"/>
+              <w:widowControl/>
+              <w:suppressLineNumbers w:val="0"/>
+              <w:spacing w:before="0" w:beforeAutospacing="0" w:after="0" w:afterAutospacing="0" w:line="14" w:lineRule="atLeast"/>
+              <w:ind w:left="0" w:right="0"/>
+              <w:rPr>
+                <w:rFonts w:hint="default" w:ascii="sans-serif" w:hAnsi="sans-serif" w:eastAsia="sans-serif" w:cs="sans-serif"/>
+              </w:rPr>
+            </w:pPr>
+            <w:r>
+              <w:rPr>
+                <w:rFonts w:hint="default" w:ascii="sans-serif" w:hAnsi="sans-serif" w:eastAsia="sans-serif" w:cs="sans-serif"/>
+                <w:b/>
+                <w:bCs/>
+              </w:rPr>
+              <w:t>Zero-Knowledge Architecture</w:t>
+            </w:r>
+          </w:p>
+          <w:p>
+            <w:pPr>
+              <w:keepNext w:val="0"/>
+              <w:keepLines w:val="0"/>
+              <w:widowControl/>
+              <w:suppressLineNumbers w:val="0"/>
+              <w:spacing w:before="0" w:beforeAutospacing="0" w:line="14" w:lineRule="atLeast"/>
+              <w:ind w:left="0" w:right="0"/>
+              <w:jc w:val="left"/>
+              <w:rPr>
+                <w:rFonts w:hint="default" w:ascii="sans-serif" w:hAnsi="sans-serif" w:eastAsia="sans-serif" w:cs="sans-serif"/>
+              </w:rPr>
+            </w:pPr>
+          </w:p>
+          <w:p>
+            <w:pPr>
+              <w:pStyle w:val="4"/>
+              <w:keepNext w:val="0"/>
+              <w:keepLines w:val="0"/>
+              <w:widowControl/>
+              <w:suppressLineNumbers w:val="0"/>
+              <w:spacing w:before="0" w:beforeAutospacing="0" w:after="0" w:afterAutospacing="0" w:line="14" w:lineRule="atLeast"/>
+              <w:ind w:left="0" w:right="0"/>
+              <w:rPr>
+                <w:rFonts w:hint="default" w:ascii="sans-serif" w:hAnsi="sans-serif" w:eastAsia="sans-serif" w:cs="sans-serif"/>
+              </w:rPr>
+            </w:pPr>
+            <w:r>
+              <w:rPr>
+                <w:rFonts w:hint="default" w:ascii="sans-serif" w:hAnsi="sans-serif" w:eastAsia="sans-serif" w:cs="sans-serif"/>
+              </w:rPr>
+              <w:t>On-device encryption. Raw chats remain private; only user-approved clinical summaries are shared.</w:t>
+            </w:r>
+          </w:p>
+        </w:tc>
+      </w:tr>
+      <w:tr>
+        <w:tblPrEx>
+          <w:tblBorders>
+            <w:top w:val="none" w:color="auto" w:sz="0" w:space="0"/>
+            <w:left w:val="none" w:color="auto" w:sz="0" w:space="0"/>
+            <w:bottom w:val="none" w:color="auto" w:sz="0" w:space="0"/>
+            <w:right w:val="none" w:color="auto" w:sz="0" w:space="0"/>
+            <w:insideH w:val="none" w:color="auto" w:sz="0" w:space="0"/>
+            <w:insideV w:val="none" w:color="auto" w:sz="0" w:space="0"/>
+          </w:tblBorders>
+          <w:shd w:val="clear"/>
+          <w:tblCellMar>
+            <w:top w:w="15" w:type="dxa"/>
+            <w:left w:w="15" w:type="dxa"/>
+            <w:bottom w:w="15" w:type="dxa"/>
+            <w:right w:w="15" w:type="dxa"/>
+          </w:tblCellMar>
+        </w:tblPrEx>
+        <w:trPr>
+          <w:tblCellSpacing w:w="15" w:type="dxa"/>
+        </w:trPr>
+        <w:tc>
+          <w:tcPr>
+            <w:tcW w:w="0" w:type="auto"/>
+            <w:tcBorders>
+              <w:top w:val="single" w:color="C4C7C5" w:sz="4" w:space="0"/>
+              <w:left w:val="single" w:color="C4C7C5" w:sz="4" w:space="0"/>
+              <w:bottom w:val="single" w:color="C4C7C5" w:sz="4" w:space="0"/>
+              <w:right w:val="single" w:color="C4C7C5" w:sz="4" w:space="0"/>
+            </w:tcBorders>
+            <w:shd w:val="clear"/>
+            <w:tcMar>
+              <w:top w:w="120" w:type="dxa"/>
+              <w:left w:w="180" w:type="dxa"/>
+              <w:bottom w:w="120" w:type="dxa"/>
+              <w:right w:w="180" w:type="dxa"/>
+            </w:tcMar>
+            <w:vAlign w:val="center"/>
+          </w:tcPr>
+          <w:p>
+            <w:pPr>
+              <w:keepNext w:val="0"/>
+              <w:keepLines w:val="0"/>
+              <w:widowControl/>
+              <w:suppressLineNumbers w:val="0"/>
+              <w:spacing w:before="0" w:beforeAutospacing="0" w:line="14" w:lineRule="atLeast"/>
+              <w:ind w:left="0" w:right="0"/>
+              <w:jc w:val="left"/>
+              <w:rPr>
+                <w:rFonts w:hint="default" w:ascii="sans-serif" w:hAnsi="sans-serif" w:eastAsia="sans-serif" w:cs="sans-serif"/>
+              </w:rPr>
+            </w:pPr>
+            <w:r>
+              <w:rPr>
+                <w:rFonts w:hint="default" w:ascii="sans-serif" w:hAnsi="sans-serif" w:eastAsia="sans-serif" w:cs="sans-serif"/>
+                <w:b/>
+                <w:bCs/>
+                <w:kern w:val="0"/>
+                <w:sz w:val="24"/>
+                <w:szCs w:val="24"/>
+                <w:lang w:val="en-US" w:eastAsia="zh-CN" w:bidi="ar"/>
+              </w:rPr>
+              <w:t>School &amp; Institutional Bridge</w:t>
+            </w:r>
+          </w:p>
+        </w:tc>
+        <w:tc>
+          <w:tcPr>
+            <w:tcW w:w="0" w:type="auto"/>
+            <w:tcBorders>
+              <w:top w:val="single" w:color="C4C7C5" w:sz="4" w:space="0"/>
+              <w:left w:val="single" w:color="C4C7C5" w:sz="4" w:space="0"/>
+              <w:bottom w:val="single" w:color="C4C7C5" w:sz="4" w:space="0"/>
+              <w:right w:val="single" w:color="C4C7C5" w:sz="4" w:space="0"/>
+            </w:tcBorders>
+            <w:shd w:val="clear"/>
+            <w:tcMar>
+              <w:top w:w="120" w:type="dxa"/>
+              <w:left w:w="180" w:type="dxa"/>
+              <w:bottom w:w="120" w:type="dxa"/>
+              <w:right w:w="180" w:type="dxa"/>
+            </w:tcMar>
+            <w:vAlign w:val="center"/>
+          </w:tcPr>
+          <w:p>
+            <w:pPr>
+              <w:keepNext w:val="0"/>
+              <w:keepLines w:val="0"/>
+              <w:widowControl/>
+              <w:suppressLineNumbers w:val="0"/>
+              <w:spacing w:before="0" w:beforeAutospacing="0" w:line="14" w:lineRule="atLeast"/>
+              <w:ind w:left="0" w:right="0"/>
+              <w:jc w:val="left"/>
+              <w:rPr>
+                <w:rFonts w:hint="default" w:ascii="sans-serif" w:hAnsi="sans-serif" w:eastAsia="sans-serif" w:cs="sans-serif"/>
+              </w:rPr>
+            </w:pPr>
+            <w:r>
+              <w:rPr>
+                <w:rFonts w:hint="default" w:ascii="sans-serif" w:hAnsi="sans-serif" w:eastAsia="sans-serif" w:cs="sans-serif"/>
+                <w:kern w:val="0"/>
+                <w:sz w:val="24"/>
+                <w:szCs w:val="24"/>
+                <w:lang w:val="en-US" w:eastAsia="zh-CN" w:bidi="ar"/>
+              </w:rPr>
+              <w:t>Reactive; counselors only intervene after a student reaches a crisis point or stops attending school (</w:t>
+            </w:r>
+            <w:r>
+              <w:rPr>
+                <w:rFonts w:hint="default" w:ascii="sans-serif" w:hAnsi="sans-serif" w:eastAsia="sans-serif" w:cs="sans-serif"/>
+                <w:i/>
+                <w:iCs/>
+                <w:kern w:val="0"/>
+                <w:sz w:val="24"/>
+                <w:szCs w:val="24"/>
+                <w:lang w:val="en-US" w:eastAsia="zh-CN" w:bidi="ar"/>
+              </w:rPr>
+              <w:t>futoukou</w:t>
+            </w:r>
+            <w:r>
+              <w:rPr>
+                <w:rFonts w:hint="default" w:ascii="sans-serif" w:hAnsi="sans-serif" w:eastAsia="sans-serif" w:cs="sans-serif"/>
+                <w:kern w:val="0"/>
+                <w:sz w:val="24"/>
+                <w:szCs w:val="24"/>
+                <w:lang w:val="en-US" w:eastAsia="zh-CN" w:bidi="ar"/>
+              </w:rPr>
+              <w:t>).</w:t>
+            </w:r>
+          </w:p>
+        </w:tc>
+        <w:tc>
+          <w:tcPr>
+            <w:tcW w:w="0" w:type="auto"/>
+            <w:tcBorders>
+              <w:top w:val="single" w:color="C4C7C5" w:sz="4" w:space="0"/>
+              <w:left w:val="single" w:color="C4C7C5" w:sz="4" w:space="0"/>
+              <w:bottom w:val="single" w:color="C4C7C5" w:sz="4" w:space="0"/>
+              <w:right w:val="single" w:color="C4C7C5" w:sz="4" w:space="0"/>
+            </w:tcBorders>
+            <w:shd w:val="clear"/>
+            <w:tcMar>
+              <w:top w:w="120" w:type="dxa"/>
+              <w:left w:w="180" w:type="dxa"/>
+              <w:bottom w:w="120" w:type="dxa"/>
+              <w:right w:w="180" w:type="dxa"/>
+            </w:tcMar>
+            <w:vAlign w:val="center"/>
+          </w:tcPr>
+          <w:p>
+            <w:pPr>
+              <w:keepNext w:val="0"/>
+              <w:keepLines w:val="0"/>
+              <w:widowControl/>
+              <w:suppressLineNumbers w:val="0"/>
+              <w:spacing w:before="0" w:beforeAutospacing="0" w:line="14" w:lineRule="atLeast"/>
+              <w:ind w:left="0" w:right="0"/>
+              <w:jc w:val="left"/>
+              <w:rPr>
+                <w:rFonts w:hint="default" w:ascii="sans-serif" w:hAnsi="sans-serif" w:eastAsia="sans-serif" w:cs="sans-serif"/>
+              </w:rPr>
+            </w:pPr>
+            <w:r>
+              <w:rPr>
+                <w:rFonts w:hint="default" w:ascii="sans-serif" w:hAnsi="sans-serif" w:eastAsia="sans-serif" w:cs="sans-serif"/>
+                <w:kern w:val="0"/>
+                <w:sz w:val="24"/>
+                <w:szCs w:val="24"/>
+                <w:lang w:val="en-US" w:eastAsia="zh-CN" w:bidi="ar"/>
+              </w:rPr>
+              <w:t>B2C only; disconnected from schools, municipal welfare departments, or local clinics.</w:t>
+            </w:r>
+          </w:p>
+        </w:tc>
+        <w:tc>
+          <w:tcPr>
+            <w:tcW w:w="0" w:type="auto"/>
+            <w:tcBorders>
+              <w:top w:val="single" w:color="C4C7C5" w:sz="4" w:space="0"/>
+              <w:left w:val="single" w:color="C4C7C5" w:sz="4" w:space="0"/>
+              <w:bottom w:val="single" w:color="C4C7C5" w:sz="4" w:space="0"/>
+              <w:right w:val="single" w:color="C4C7C5" w:sz="4" w:space="0"/>
+            </w:tcBorders>
+            <w:shd w:val="clear"/>
+            <w:tcMar>
+              <w:top w:w="120" w:type="dxa"/>
+              <w:left w:w="180" w:type="dxa"/>
+              <w:bottom w:w="120" w:type="dxa"/>
+              <w:right w:w="180" w:type="dxa"/>
+            </w:tcMar>
+            <w:vAlign w:val="center"/>
+          </w:tcPr>
+          <w:p>
+            <w:pPr>
+              <w:pStyle w:val="4"/>
+              <w:keepNext w:val="0"/>
+              <w:keepLines w:val="0"/>
+              <w:widowControl/>
+              <w:suppressLineNumbers w:val="0"/>
+              <w:spacing w:before="0" w:beforeAutospacing="0" w:after="0" w:afterAutospacing="0" w:line="14" w:lineRule="atLeast"/>
+              <w:ind w:left="0" w:right="0"/>
+              <w:rPr>
+                <w:rFonts w:hint="default" w:ascii="sans-serif" w:hAnsi="sans-serif" w:eastAsia="sans-serif" w:cs="sans-serif"/>
+              </w:rPr>
+            </w:pPr>
+            <w:r>
+              <w:rPr>
+                <w:rFonts w:hint="default" w:ascii="sans-serif" w:hAnsi="sans-serif" w:eastAsia="sans-serif" w:cs="sans-serif"/>
+                <w:b/>
+                <w:bCs/>
+              </w:rPr>
+              <w:t>Proactive B2G/B2B Model</w:t>
+            </w:r>
+          </w:p>
+          <w:p>
+            <w:pPr>
+              <w:keepNext w:val="0"/>
+              <w:keepLines w:val="0"/>
+              <w:widowControl/>
+              <w:suppressLineNumbers w:val="0"/>
+              <w:spacing w:before="0" w:beforeAutospacing="0" w:line="14" w:lineRule="atLeast"/>
+              <w:ind w:left="0" w:right="0"/>
+              <w:jc w:val="left"/>
+              <w:rPr>
+                <w:rFonts w:hint="default" w:ascii="sans-serif" w:hAnsi="sans-serif" w:eastAsia="sans-serif" w:cs="sans-serif"/>
+              </w:rPr>
+            </w:pPr>
+          </w:p>
+          <w:p>
+            <w:pPr>
+              <w:pStyle w:val="4"/>
+              <w:keepNext w:val="0"/>
+              <w:keepLines w:val="0"/>
+              <w:widowControl/>
+              <w:suppressLineNumbers w:val="0"/>
+              <w:spacing w:before="0" w:beforeAutospacing="0" w:after="0" w:afterAutospacing="0" w:line="14" w:lineRule="atLeast"/>
+              <w:ind w:left="0" w:right="0"/>
+              <w:rPr>
+                <w:rFonts w:hint="default" w:ascii="sans-serif" w:hAnsi="sans-serif" w:eastAsia="sans-serif" w:cs="sans-serif"/>
+              </w:rPr>
+            </w:pPr>
+            <w:r>
+              <w:rPr>
+                <w:rFonts w:hint="default" w:ascii="sans-serif" w:hAnsi="sans-serif" w:eastAsia="sans-serif" w:cs="sans-serif"/>
+              </w:rPr>
+              <w:t>Provides privacy-preserving, aggregated mood trends to municipalities/schools while offering a direct, voluntary bridge to local clinics.</w:t>
+            </w:r>
+          </w:p>
+        </w:tc>
+      </w:tr>
+      <w:tr>
+        <w:tblPrEx>
+          <w:tblBorders>
+            <w:top w:val="none" w:color="auto" w:sz="0" w:space="0"/>
+            <w:left w:val="none" w:color="auto" w:sz="0" w:space="0"/>
+            <w:bottom w:val="none" w:color="auto" w:sz="0" w:space="0"/>
+            <w:right w:val="none" w:color="auto" w:sz="0" w:space="0"/>
+            <w:insideH w:val="none" w:color="auto" w:sz="0" w:space="0"/>
+            <w:insideV w:val="none" w:color="auto" w:sz="0" w:space="0"/>
+          </w:tblBorders>
+          <w:shd w:val="clear"/>
+          <w:tblCellMar>
+            <w:top w:w="15" w:type="dxa"/>
+            <w:left w:w="15" w:type="dxa"/>
+            <w:bottom w:w="15" w:type="dxa"/>
+            <w:right w:w="15" w:type="dxa"/>
+          </w:tblCellMar>
+        </w:tblPrEx>
+        <w:trPr>
+          <w:tblCellSpacing w:w="15" w:type="dxa"/>
+        </w:trPr>
+        <w:tc>
+          <w:tcPr>
+            <w:tcW w:w="0" w:type="auto"/>
+            <w:tcBorders>
+              <w:top w:val="single" w:color="C4C7C5" w:sz="4" w:space="0"/>
+              <w:left w:val="single" w:color="C4C7C5" w:sz="4" w:space="0"/>
+              <w:bottom w:val="single" w:color="C4C7C5" w:sz="4" w:space="0"/>
+              <w:right w:val="single" w:color="C4C7C5" w:sz="4" w:space="0"/>
+            </w:tcBorders>
+            <w:shd w:val="clear"/>
+            <w:tcMar>
+              <w:top w:w="120" w:type="dxa"/>
+              <w:left w:w="180" w:type="dxa"/>
+              <w:bottom w:w="120" w:type="dxa"/>
+              <w:right w:w="180" w:type="dxa"/>
+            </w:tcMar>
+            <w:vAlign w:val="center"/>
+          </w:tcPr>
+          <w:p>
+            <w:pPr>
+              <w:keepNext w:val="0"/>
+              <w:keepLines w:val="0"/>
+              <w:widowControl/>
+              <w:suppressLineNumbers w:val="0"/>
+              <w:spacing w:before="0" w:beforeAutospacing="0" w:line="14" w:lineRule="atLeast"/>
+              <w:ind w:left="0" w:right="0"/>
+              <w:jc w:val="left"/>
+              <w:rPr>
+                <w:rFonts w:hint="default" w:ascii="sans-serif" w:hAnsi="sans-serif" w:eastAsia="sans-serif" w:cs="sans-serif"/>
+              </w:rPr>
+            </w:pPr>
+            <w:r>
+              <w:rPr>
+                <w:rFonts w:hint="default" w:ascii="sans-serif" w:hAnsi="sans-serif" w:eastAsia="sans-serif" w:cs="sans-serif"/>
+                <w:b/>
+                <w:bCs/>
+                <w:kern w:val="0"/>
+                <w:sz w:val="24"/>
+                <w:szCs w:val="24"/>
+                <w:lang w:val="en-US" w:eastAsia="zh-CN" w:bidi="ar"/>
+              </w:rPr>
+              <w:t>Crisis Intervention &amp; Triage</w:t>
+            </w:r>
+          </w:p>
+        </w:tc>
+        <w:tc>
+          <w:tcPr>
+            <w:tcW w:w="0" w:type="auto"/>
+            <w:tcBorders>
+              <w:top w:val="single" w:color="C4C7C5" w:sz="4" w:space="0"/>
+              <w:left w:val="single" w:color="C4C7C5" w:sz="4" w:space="0"/>
+              <w:bottom w:val="single" w:color="C4C7C5" w:sz="4" w:space="0"/>
+              <w:right w:val="single" w:color="C4C7C5" w:sz="4" w:space="0"/>
+            </w:tcBorders>
+            <w:shd w:val="clear"/>
+            <w:tcMar>
+              <w:top w:w="120" w:type="dxa"/>
+              <w:left w:w="180" w:type="dxa"/>
+              <w:bottom w:w="120" w:type="dxa"/>
+              <w:right w:w="180" w:type="dxa"/>
+            </w:tcMar>
+            <w:vAlign w:val="center"/>
+          </w:tcPr>
+          <w:p>
+            <w:pPr>
+              <w:keepNext w:val="0"/>
+              <w:keepLines w:val="0"/>
+              <w:widowControl/>
+              <w:suppressLineNumbers w:val="0"/>
+              <w:spacing w:before="0" w:beforeAutospacing="0" w:line="14" w:lineRule="atLeast"/>
+              <w:ind w:left="0" w:right="0"/>
+              <w:jc w:val="left"/>
+              <w:rPr>
+                <w:rFonts w:hint="default" w:ascii="sans-serif" w:hAnsi="sans-serif" w:eastAsia="sans-serif" w:cs="sans-serif"/>
+              </w:rPr>
+            </w:pPr>
+            <w:r>
+              <w:rPr>
+                <w:rFonts w:hint="default" w:ascii="sans-serif" w:hAnsi="sans-serif" w:eastAsia="sans-serif" w:cs="sans-serif"/>
+                <w:kern w:val="0"/>
+                <w:sz w:val="24"/>
+                <w:szCs w:val="24"/>
+                <w:lang w:val="en-US" w:eastAsia="zh-CN" w:bidi="ar"/>
+              </w:rPr>
+              <w:t>Dependent on the individual making direct contact during business hours.</w:t>
+            </w:r>
+          </w:p>
+        </w:tc>
+        <w:tc>
+          <w:tcPr>
+            <w:tcW w:w="0" w:type="auto"/>
+            <w:tcBorders>
+              <w:top w:val="single" w:color="C4C7C5" w:sz="4" w:space="0"/>
+              <w:left w:val="single" w:color="C4C7C5" w:sz="4" w:space="0"/>
+              <w:bottom w:val="single" w:color="C4C7C5" w:sz="4" w:space="0"/>
+              <w:right w:val="single" w:color="C4C7C5" w:sz="4" w:space="0"/>
+            </w:tcBorders>
+            <w:shd w:val="clear"/>
+            <w:tcMar>
+              <w:top w:w="120" w:type="dxa"/>
+              <w:left w:w="180" w:type="dxa"/>
+              <w:bottom w:w="120" w:type="dxa"/>
+              <w:right w:w="180" w:type="dxa"/>
+            </w:tcMar>
+            <w:vAlign w:val="center"/>
+          </w:tcPr>
+          <w:p>
+            <w:pPr>
+              <w:keepNext w:val="0"/>
+              <w:keepLines w:val="0"/>
+              <w:widowControl/>
+              <w:suppressLineNumbers w:val="0"/>
+              <w:spacing w:before="0" w:beforeAutospacing="0" w:line="14" w:lineRule="atLeast"/>
+              <w:ind w:left="0" w:right="0"/>
+              <w:jc w:val="left"/>
+              <w:rPr>
+                <w:rFonts w:hint="default" w:ascii="sans-serif" w:hAnsi="sans-serif" w:eastAsia="sans-serif" w:cs="sans-serif"/>
+              </w:rPr>
+            </w:pPr>
+            <w:r>
+              <w:rPr>
+                <w:rFonts w:hint="default" w:ascii="sans-serif" w:hAnsi="sans-serif" w:eastAsia="sans-serif" w:cs="sans-serif"/>
+                <w:kern w:val="0"/>
+                <w:sz w:val="24"/>
+                <w:szCs w:val="24"/>
+                <w:lang w:val="en-US" w:eastAsia="zh-CN" w:bidi="ar"/>
+              </w:rPr>
+              <w:t>Basic keyword detection or automated chatbot referrals.</w:t>
+            </w:r>
+          </w:p>
+        </w:tc>
+        <w:tc>
+          <w:tcPr>
+            <w:tcW w:w="0" w:type="auto"/>
+            <w:tcBorders>
+              <w:top w:val="single" w:color="C4C7C5" w:sz="4" w:space="0"/>
+              <w:left w:val="single" w:color="C4C7C5" w:sz="4" w:space="0"/>
+              <w:bottom w:val="single" w:color="C4C7C5" w:sz="4" w:space="0"/>
+              <w:right w:val="single" w:color="C4C7C5" w:sz="4" w:space="0"/>
+            </w:tcBorders>
+            <w:shd w:val="clear"/>
+            <w:tcMar>
+              <w:top w:w="120" w:type="dxa"/>
+              <w:left w:w="180" w:type="dxa"/>
+              <w:bottom w:w="120" w:type="dxa"/>
+              <w:right w:w="180" w:type="dxa"/>
+            </w:tcMar>
+            <w:vAlign w:val="center"/>
+          </w:tcPr>
+          <w:p>
+            <w:pPr>
+              <w:pStyle w:val="4"/>
+              <w:keepNext w:val="0"/>
+              <w:keepLines w:val="0"/>
+              <w:widowControl/>
+              <w:suppressLineNumbers w:val="0"/>
+              <w:spacing w:before="0" w:beforeAutospacing="0" w:after="0" w:afterAutospacing="0" w:line="14" w:lineRule="atLeast"/>
+              <w:ind w:left="0" w:right="0"/>
+              <w:rPr>
+                <w:rFonts w:hint="default" w:ascii="sans-serif" w:hAnsi="sans-serif" w:eastAsia="sans-serif" w:cs="sans-serif"/>
+              </w:rPr>
+            </w:pPr>
+            <w:r>
+              <w:rPr>
+                <w:rFonts w:hint="default" w:ascii="sans-serif" w:hAnsi="sans-serif" w:eastAsia="sans-serif" w:cs="sans-serif"/>
+                <w:b/>
+                <w:bCs/>
+              </w:rPr>
+              <w:t>24/7 Multi-Agent Guardrails</w:t>
+            </w:r>
+          </w:p>
+          <w:p>
+            <w:pPr>
+              <w:keepNext w:val="0"/>
+              <w:keepLines w:val="0"/>
+              <w:widowControl/>
+              <w:suppressLineNumbers w:val="0"/>
+              <w:spacing w:before="0" w:beforeAutospacing="0" w:line="14" w:lineRule="atLeast"/>
+              <w:ind w:left="0" w:right="0"/>
+              <w:jc w:val="left"/>
+              <w:rPr>
+                <w:rFonts w:hint="default" w:ascii="sans-serif" w:hAnsi="sans-serif" w:eastAsia="sans-serif" w:cs="sans-serif"/>
+              </w:rPr>
+            </w:pPr>
+          </w:p>
+          <w:p>
+            <w:pPr>
+              <w:pStyle w:val="4"/>
+              <w:keepNext w:val="0"/>
+              <w:keepLines w:val="0"/>
+              <w:widowControl/>
+              <w:suppressLineNumbers w:val="0"/>
+              <w:spacing w:before="0" w:beforeAutospacing="0" w:after="0" w:afterAutospacing="0" w:line="14" w:lineRule="atLeast"/>
+              <w:ind w:left="0" w:right="0"/>
+              <w:rPr>
+                <w:rFonts w:hint="default" w:ascii="sans-serif" w:hAnsi="sans-serif" w:eastAsia="sans-serif" w:cs="sans-serif"/>
+              </w:rPr>
+            </w:pPr>
+            <w:r>
+              <w:rPr>
+                <w:rFonts w:hint="default" w:ascii="sans-serif" w:hAnsi="sans-serif" w:eastAsia="sans-serif" w:cs="sans-serif"/>
+              </w:rPr>
+              <w:t>Hardcoded crisis triage that immediately escalates high-risk cases to local human helplines while maintaining a comforting persona.</w:t>
+            </w:r>
+          </w:p>
+        </w:tc>
+      </w:tr>
+      <w:tr>
+        <w:tblPrEx>
+          <w:tblBorders>
+            <w:top w:val="none" w:color="auto" w:sz="0" w:space="0"/>
+            <w:left w:val="none" w:color="auto" w:sz="0" w:space="0"/>
+            <w:bottom w:val="none" w:color="auto" w:sz="0" w:space="0"/>
+            <w:right w:val="none" w:color="auto" w:sz="0" w:space="0"/>
+            <w:insideH w:val="none" w:color="auto" w:sz="0" w:space="0"/>
+            <w:insideV w:val="none" w:color="auto" w:sz="0" w:space="0"/>
+          </w:tblBorders>
+          <w:shd w:val="clear"/>
+          <w:tblCellMar>
+            <w:top w:w="15" w:type="dxa"/>
+            <w:left w:w="15" w:type="dxa"/>
+            <w:bottom w:w="15" w:type="dxa"/>
+            <w:right w:w="15" w:type="dxa"/>
+          </w:tblCellMar>
+        </w:tblPrEx>
+        <w:trPr>
+          <w:tblCellSpacing w:w="15" w:type="dxa"/>
+        </w:trPr>
+        <w:tc>
+          <w:tcPr>
+            <w:tcW w:w="0" w:type="auto"/>
+            <w:tcBorders>
+              <w:top w:val="single" w:color="C4C7C5" w:sz="4" w:space="0"/>
+              <w:left w:val="single" w:color="C4C7C5" w:sz="4" w:space="0"/>
+              <w:bottom w:val="single" w:color="C4C7C5" w:sz="4" w:space="0"/>
+              <w:right w:val="single" w:color="C4C7C5" w:sz="4" w:space="0"/>
+            </w:tcBorders>
+            <w:shd w:val="clear"/>
+            <w:tcMar>
+              <w:top w:w="120" w:type="dxa"/>
+              <w:left w:w="180" w:type="dxa"/>
+              <w:bottom w:w="120" w:type="dxa"/>
+              <w:right w:w="180" w:type="dxa"/>
+            </w:tcMar>
+            <w:vAlign w:val="center"/>
+          </w:tcPr>
+          <w:p>
+            <w:pPr>
+              <w:keepNext w:val="0"/>
+              <w:keepLines w:val="0"/>
+              <w:widowControl/>
+              <w:suppressLineNumbers w:val="0"/>
+              <w:spacing w:before="0" w:beforeAutospacing="0" w:line="14" w:lineRule="atLeast"/>
+              <w:ind w:left="0" w:right="0"/>
+              <w:jc w:val="left"/>
+              <w:rPr>
+                <w:rFonts w:hint="default" w:ascii="sans-serif" w:hAnsi="sans-serif" w:eastAsia="sans-serif" w:cs="sans-serif"/>
+              </w:rPr>
+            </w:pPr>
+            <w:r>
+              <w:rPr>
+                <w:rFonts w:hint="default" w:ascii="sans-serif" w:hAnsi="sans-serif" w:eastAsia="sans-serif" w:cs="sans-serif"/>
+                <w:b/>
+                <w:bCs/>
+                <w:kern w:val="0"/>
+                <w:sz w:val="24"/>
+                <w:szCs w:val="24"/>
+                <w:lang w:val="en-US" w:eastAsia="zh-CN" w:bidi="ar"/>
+              </w:rPr>
+              <w:t>Practice &amp; Rehearsal Capabilities</w:t>
+            </w:r>
+          </w:p>
+        </w:tc>
+        <w:tc>
+          <w:tcPr>
+            <w:tcW w:w="0" w:type="auto"/>
+            <w:tcBorders>
+              <w:top w:val="single" w:color="C4C7C5" w:sz="4" w:space="0"/>
+              <w:left w:val="single" w:color="C4C7C5" w:sz="4" w:space="0"/>
+              <w:bottom w:val="single" w:color="C4C7C5" w:sz="4" w:space="0"/>
+              <w:right w:val="single" w:color="C4C7C5" w:sz="4" w:space="0"/>
+            </w:tcBorders>
+            <w:shd w:val="clear"/>
+            <w:tcMar>
+              <w:top w:w="120" w:type="dxa"/>
+              <w:left w:w="180" w:type="dxa"/>
+              <w:bottom w:w="120" w:type="dxa"/>
+              <w:right w:w="180" w:type="dxa"/>
+            </w:tcMar>
+            <w:vAlign w:val="center"/>
+          </w:tcPr>
+          <w:p>
+            <w:pPr>
+              <w:keepNext w:val="0"/>
+              <w:keepLines w:val="0"/>
+              <w:widowControl/>
+              <w:suppressLineNumbers w:val="0"/>
+              <w:spacing w:before="0" w:beforeAutospacing="0" w:line="14" w:lineRule="atLeast"/>
+              <w:ind w:left="0" w:right="0"/>
+              <w:jc w:val="left"/>
+              <w:rPr>
+                <w:rFonts w:hint="default" w:ascii="sans-serif" w:hAnsi="sans-serif" w:eastAsia="sans-serif" w:cs="sans-serif"/>
+              </w:rPr>
+            </w:pPr>
+            <w:r>
+              <w:rPr>
+                <w:rFonts w:hint="default" w:ascii="sans-serif" w:hAnsi="sans-serif" w:eastAsia="sans-serif" w:cs="sans-serif"/>
+                <w:kern w:val="0"/>
+                <w:sz w:val="24"/>
+                <w:szCs w:val="24"/>
+                <w:lang w:val="en-US" w:eastAsia="zh-CN" w:bidi="ar"/>
+              </w:rPr>
+              <w:t>Limited to verbal advice from a counselor.</w:t>
+            </w:r>
+          </w:p>
+        </w:tc>
+        <w:tc>
+          <w:tcPr>
+            <w:tcW w:w="0" w:type="auto"/>
+            <w:tcBorders>
+              <w:top w:val="single" w:color="C4C7C5" w:sz="4" w:space="0"/>
+              <w:left w:val="single" w:color="C4C7C5" w:sz="4" w:space="0"/>
+              <w:bottom w:val="single" w:color="C4C7C5" w:sz="4" w:space="0"/>
+              <w:right w:val="single" w:color="C4C7C5" w:sz="4" w:space="0"/>
+            </w:tcBorders>
+            <w:shd w:val="clear"/>
+            <w:tcMar>
+              <w:top w:w="120" w:type="dxa"/>
+              <w:left w:w="180" w:type="dxa"/>
+              <w:bottom w:w="120" w:type="dxa"/>
+              <w:right w:w="180" w:type="dxa"/>
+            </w:tcMar>
+            <w:vAlign w:val="center"/>
+          </w:tcPr>
+          <w:p>
+            <w:pPr>
+              <w:keepNext w:val="0"/>
+              <w:keepLines w:val="0"/>
+              <w:widowControl/>
+              <w:suppressLineNumbers w:val="0"/>
+              <w:spacing w:before="0" w:beforeAutospacing="0" w:line="14" w:lineRule="atLeast"/>
+              <w:ind w:left="0" w:right="0"/>
+              <w:jc w:val="left"/>
+              <w:rPr>
+                <w:rFonts w:hint="default" w:ascii="sans-serif" w:hAnsi="sans-serif" w:eastAsia="sans-serif" w:cs="sans-serif"/>
+              </w:rPr>
+            </w:pPr>
+            <w:r>
+              <w:rPr>
+                <w:rFonts w:hint="default" w:ascii="sans-serif" w:hAnsi="sans-serif" w:eastAsia="sans-serif" w:cs="sans-serif"/>
+                <w:kern w:val="0"/>
+                <w:sz w:val="24"/>
+                <w:szCs w:val="24"/>
+                <w:lang w:val="en-US" w:eastAsia="zh-CN" w:bidi="ar"/>
+              </w:rPr>
+              <w:t>None (static text or audio logs).</w:t>
+            </w:r>
+          </w:p>
+        </w:tc>
+        <w:tc>
+          <w:tcPr>
+            <w:tcW w:w="0" w:type="auto"/>
+            <w:tcBorders>
+              <w:top w:val="single" w:color="C4C7C5" w:sz="4" w:space="0"/>
+              <w:left w:val="single" w:color="C4C7C5" w:sz="4" w:space="0"/>
+              <w:bottom w:val="single" w:color="C4C7C5" w:sz="4" w:space="0"/>
+              <w:right w:val="single" w:color="C4C7C5" w:sz="4" w:space="0"/>
+            </w:tcBorders>
+            <w:shd w:val="clear"/>
+            <w:tcMar>
+              <w:top w:w="120" w:type="dxa"/>
+              <w:left w:w="180" w:type="dxa"/>
+              <w:bottom w:w="120" w:type="dxa"/>
+              <w:right w:w="180" w:type="dxa"/>
+            </w:tcMar>
+            <w:vAlign w:val="center"/>
+          </w:tcPr>
+          <w:p>
+            <w:pPr>
+              <w:pStyle w:val="4"/>
+              <w:keepNext w:val="0"/>
+              <w:keepLines w:val="0"/>
+              <w:widowControl/>
+              <w:suppressLineNumbers w:val="0"/>
+              <w:spacing w:before="0" w:beforeAutospacing="0" w:after="0" w:afterAutospacing="0" w:line="14" w:lineRule="atLeast"/>
+              <w:ind w:left="0" w:right="0"/>
+              <w:rPr>
+                <w:rFonts w:hint="default" w:ascii="sans-serif" w:hAnsi="sans-serif" w:eastAsia="sans-serif" w:cs="sans-serif"/>
+              </w:rPr>
+            </w:pPr>
+            <w:r>
+              <w:rPr>
+                <w:rFonts w:hint="default" w:ascii="sans-serif" w:hAnsi="sans-serif" w:eastAsia="sans-serif" w:cs="sans-serif"/>
+                <w:b/>
+                <w:bCs/>
+              </w:rPr>
+              <w:t>VR Roleplay Simulation</w:t>
+            </w:r>
+          </w:p>
+          <w:p>
+            <w:pPr>
+              <w:keepNext w:val="0"/>
+              <w:keepLines w:val="0"/>
+              <w:widowControl/>
+              <w:suppressLineNumbers w:val="0"/>
+              <w:spacing w:before="0" w:beforeAutospacing="0" w:line="14" w:lineRule="atLeast"/>
+              <w:ind w:left="0" w:right="0"/>
+              <w:jc w:val="left"/>
+              <w:rPr>
+                <w:rFonts w:hint="default" w:ascii="sans-serif" w:hAnsi="sans-serif" w:eastAsia="sans-serif" w:cs="sans-serif"/>
+              </w:rPr>
+            </w:pPr>
+          </w:p>
+          <w:p>
+            <w:pPr>
+              <w:pStyle w:val="4"/>
+              <w:keepNext w:val="0"/>
+              <w:keepLines w:val="0"/>
+              <w:widowControl/>
+              <w:suppressLineNumbers w:val="0"/>
+              <w:spacing w:before="0" w:beforeAutospacing="0" w:after="0" w:afterAutospacing="0" w:line="14" w:lineRule="atLeast"/>
+              <w:ind w:left="0" w:right="0"/>
+              <w:rPr>
+                <w:rFonts w:hint="default" w:ascii="sans-serif" w:hAnsi="sans-serif" w:eastAsia="sans-serif" w:cs="sans-serif"/>
+              </w:rPr>
+            </w:pPr>
+            <w:r>
+              <w:rPr>
+                <w:rFonts w:hint="default" w:ascii="sans-serif" w:hAnsi="sans-serif" w:eastAsia="sans-serif" w:cs="sans-serif"/>
+              </w:rPr>
+              <w:t>Allows anxious students to practice scenarios (e.g., "talking to a teacher" or "asking a friend for help") before real-world execution.</w:t>
+            </w:r>
+          </w:p>
+        </w:tc>
+      </w:tr>
+    </w:tbl>
+    <w:p>
+      <w:pPr>
+        <w:pStyle w:val="4"/>
+        <w:keepNext w:val="0"/>
+        <w:keepLines w:val="0"/>
+        <w:widowControl/>
+        <w:suppressLineNumbers w:val="0"/>
+        <w:jc w:val="left"/>
+        <w:rPr>
+          <w:rFonts w:hint="default" w:asciiTheme="minorHAnsi" w:hAnsiTheme="minorHAnsi" w:eastAsiaTheme="minorEastAsia" w:cstheme="minorBidi"/>
+          <w:kern w:val="0"/>
+          <w:sz w:val="20"/>
+          <w:szCs w:val="20"/>
+          <w:lang w:val="en-MY" w:eastAsia="zh-CN" w:bidi="ar-SA"/>
+        </w:rPr>
+      </w:pPr>
+      <w:bookmarkStart w:id="0" w:name="_GoBack"/>
+      <w:bookmarkEnd w:id="0"/>
     </w:p>
     <w:p>
       <w:pPr>
@@ -1064,6 +2801,16 @@
       <w:lang w:val="en-US" w:eastAsia="zh-CN" w:bidi="ar"/>
     </w:rPr>
   </w:style>
+  <w:style w:type="character" w:styleId="5">
+    <w:name w:val="Strong"/>
+    <w:basedOn w:val="2"/>
+    <w:qFormat/>
+    <w:uiPriority w:val="0"/>
+    <w:rPr>
+      <w:b/>
+      <w:bCs/>
+    </w:rPr>
+  </w:style>
 </w:styles>
 </file>
 

</xml_diff>